<commit_message>
Migliorati esteticamente modelli .docx per creazione dei documenti finali
</commit_message>
<xml_diff>
--- a/frontend/public/MODELLO_PDP_BES.docx
+++ b/frontend/public/MODELLO_PDP_BES.docx
@@ -30303,10 +30303,7 @@
         </w:tc>
       </w:tr>
     </w:tbl>
-    <w:p>
-      <w:bookmarkStart w:id="0" w:name="_GoBack"/>
-      <w:bookmarkEnd w:id="0"/>
-    </w:p>
+    <w:p/>
     <w:tbl>
       <w:tblPr>
         <w:tblStyle w:val="Grigliatabella"/>
@@ -30839,6 +30836,7 @@
           </w:tcPr>
           <w:p>
             <w:pPr>
+              <w:spacing w:before="100" w:after="100"/>
               <w:jc w:val="center"/>
             </w:pPr>
             <w:r>
@@ -30865,6 +30863,7 @@
           </w:tcPr>
           <w:p>
             <w:pPr>
+              <w:spacing w:after="0"/>
               <w:jc w:val="center"/>
               <w:rPr>
                 <w:sz w:val="24"/>
@@ -30908,6 +30907,7 @@
           </w:tcPr>
           <w:p>
             <w:pPr>
+              <w:spacing w:before="100" w:after="100"/>
               <w:jc w:val="center"/>
             </w:pPr>
             <w:r>
@@ -30934,6 +30934,7 @@
           </w:tcPr>
           <w:p>
             <w:pPr>
+              <w:spacing w:after="0"/>
               <w:jc w:val="center"/>
               <w:rPr>
                 <w:sz w:val="24"/>
@@ -30970,6 +30971,7 @@
           </w:tcPr>
           <w:p>
             <w:pPr>
+              <w:spacing w:before="100" w:after="100"/>
               <w:jc w:val="center"/>
             </w:pPr>
             <w:r>
@@ -30996,6 +30998,7 @@
           </w:tcPr>
           <w:p>
             <w:pPr>
+              <w:spacing w:after="0"/>
               <w:jc w:val="center"/>
               <w:rPr>
                 <w:sz w:val="24"/>
@@ -31032,6 +31035,7 @@
           </w:tcPr>
           <w:p>
             <w:pPr>
+              <w:spacing w:before="100" w:after="100"/>
               <w:jc w:val="center"/>
             </w:pPr>
             <w:r>
@@ -31058,6 +31062,7 @@
           </w:tcPr>
           <w:p>
             <w:pPr>
+              <w:spacing w:after="0"/>
               <w:jc w:val="center"/>
               <w:rPr>
                 <w:sz w:val="24"/>
@@ -31074,6 +31079,7 @@
           </w:p>
           <w:p>
             <w:pPr>
+              <w:spacing w:after="0"/>
               <w:jc w:val="center"/>
               <w:rPr>
                 <w:sz w:val="24"/>
@@ -31117,6 +31123,7 @@
           </w:tcPr>
           <w:p>
             <w:pPr>
+              <w:spacing w:before="100" w:after="100"/>
               <w:jc w:val="center"/>
             </w:pPr>
             <w:r>
@@ -31143,6 +31150,7 @@
           </w:tcPr>
           <w:p>
             <w:pPr>
+              <w:spacing w:after="0"/>
               <w:jc w:val="center"/>
               <w:rPr>
                 <w:sz w:val="24"/>
@@ -31179,6 +31187,7 @@
           </w:tcPr>
           <w:p>
             <w:pPr>
+              <w:spacing w:before="100" w:after="100"/>
               <w:jc w:val="center"/>
             </w:pPr>
             <w:r>
@@ -31205,6 +31214,7 @@
           </w:tcPr>
           <w:p>
             <w:pPr>
+              <w:spacing w:after="0"/>
               <w:jc w:val="center"/>
               <w:rPr>
                 <w:sz w:val="24"/>
@@ -31241,6 +31251,7 @@
           </w:tcPr>
           <w:p>
             <w:pPr>
+              <w:spacing w:before="100" w:after="100"/>
               <w:jc w:val="center"/>
             </w:pPr>
             <w:r>
@@ -31267,6 +31278,7 @@
           </w:tcPr>
           <w:p>
             <w:pPr>
+              <w:spacing w:after="0"/>
               <w:jc w:val="center"/>
               <w:rPr>
                 <w:sz w:val="24"/>
@@ -31283,6 +31295,7 @@
           </w:p>
           <w:p>
             <w:pPr>
+              <w:spacing w:after="0"/>
               <w:jc w:val="center"/>
               <w:rPr>
                 <w:sz w:val="24"/>
@@ -31326,6 +31339,7 @@
           </w:tcPr>
           <w:p>
             <w:pPr>
+              <w:spacing w:before="100" w:after="100"/>
               <w:jc w:val="center"/>
             </w:pPr>
             <w:r>
@@ -31388,6 +31402,7 @@
           </w:tcPr>
           <w:p>
             <w:pPr>
+              <w:spacing w:before="100" w:after="100"/>
               <w:jc w:val="center"/>
             </w:pPr>
             <w:r>
@@ -31448,6 +31463,7 @@
           </w:tcPr>
           <w:p>
             <w:pPr>
+              <w:spacing w:before="100" w:after="100"/>
               <w:jc w:val="center"/>
             </w:pPr>
             <w:r>
@@ -31508,6 +31524,7 @@
           </w:tcPr>
           <w:p>
             <w:pPr>
+              <w:spacing w:before="100" w:after="100"/>
               <w:jc w:val="center"/>
             </w:pPr>
             <w:r>
@@ -31568,6 +31585,7 @@
           </w:tcPr>
           <w:p>
             <w:pPr>
+              <w:spacing w:before="100" w:after="100"/>
               <w:jc w:val="center"/>
             </w:pPr>
             <w:r>
@@ -31629,6 +31647,7 @@
           </w:tcPr>
           <w:p>
             <w:pPr>
+              <w:spacing w:before="120" w:after="120"/>
               <w:jc w:val="center"/>
             </w:pPr>
             <w:r>
@@ -31655,33 +31674,28 @@
           </w:tcPr>
           <w:p>
             <w:pPr>
+              <w:spacing w:before="140" w:after="120"/>
               <w:jc w:val="center"/>
               <w:rPr>
                 <w:sz w:val="24"/>
                 <w:szCs w:val="24"/>
               </w:rPr>
             </w:pPr>
-          </w:p>
-          <w:p>
-            <w:pPr>
-              <w:jc w:val="center"/>
+            <w:r>
               <w:rPr>
                 <w:sz w:val="24"/>
                 <w:szCs w:val="24"/>
               </w:rPr>
-            </w:pPr>
-            <w:r>
-              <w:rPr>
-                <w:sz w:val="24"/>
-                <w:szCs w:val="24"/>
-              </w:rPr>
               <w:t>Fossano, ……………………………………………………………….</w:t>
             </w:r>
           </w:p>
         </w:tc>
       </w:tr>
     </w:tbl>
-    <w:p/>
+    <w:p>
+      <w:bookmarkStart w:id="0" w:name="_GoBack"/>
+      <w:bookmarkEnd w:id="0"/>
+    </w:p>
     <w:sectPr>
       <w:pgSz w:w="16838" w:h="11906" w:orient="landscape"/>
       <w:pgMar w:top="1134" w:right="1417" w:bottom="1134" w:left="1134" w:header="708" w:footer="708" w:gutter="0"/>
@@ -31757,7 +31771,7 @@
           <w:rPr>
             <w:noProof/>
           </w:rPr>
-          <w:t>1</w:t>
+          <w:t>7</w:t>
         </w:r>
         <w:r>
           <w:fldChar w:fldCharType="end"/>
@@ -32775,7 +32789,7 @@
 </file>
 
 <file path=customXml/itemProps1.xml><?xml version="1.0" encoding="utf-8"?>
-<ds:datastoreItem xmlns:ds="http://schemas.openxmlformats.org/officeDocument/2006/customXml" ds:itemID="{617034CC-0AF3-43DA-B16E-23D03D75803C}">
+<ds:datastoreItem xmlns:ds="http://schemas.openxmlformats.org/officeDocument/2006/customXml" ds:itemID="{18DEFD75-ECD0-4A54-8693-A4BAEB1A8DA1}">
   <ds:schemaRefs>
     <ds:schemaRef ds:uri="http://schemas.openxmlformats.org/officeDocument/2006/bibliography"/>
   </ds:schemaRefs>

</xml_diff>